<commit_message>
WordOutput - Settlement departaments
</commit_message>
<xml_diff>
--- a/FFS/template.docx
+++ b/FFS/template.docx
@@ -885,6 +885,14 @@
                 <w:szCs w:val="18"/>
               </w:rPr>
             </w:pPr>
+            <w:r>
+              <w:rPr>
+                <w:rFonts w:ascii="Times New Roman" w:hAnsi="Times New Roman" w:cs="Times New Roman"/>
+                <w:sz w:val="18"/>
+                <w:szCs w:val="18"/>
+              </w:rPr>
+              <w:t>{{Department}}</w:t>
+            </w:r>
           </w:p>
         </w:tc>
         <w:tc>

</xml_diff>

<commit_message>
Word export time fix, OPTKP logic, font and size standardization
</commit_message>
<xml_diff>
--- a/FFS/template.docx
+++ b/FFS/template.docx
@@ -916,7 +916,27 @@
                 <w:szCs w:val="18"/>
                 <w:lang w:val="en-US"/>
               </w:rPr>
-              <w:t>{{SettlementName}}</w:t>
+              <w:t>{{</w:t>
+            </w:r>
+            <w:proofErr w:type="spellStart"/>
+            <w:r>
+              <w:rPr>
+                <w:bCs/>
+                <w:sz w:val="18"/>
+                <w:szCs w:val="18"/>
+                <w:lang w:val="en-US"/>
+              </w:rPr>
+              <w:t>SettlementName</w:t>
+            </w:r>
+            <w:proofErr w:type="spellEnd"/>
+            <w:r>
+              <w:rPr>
+                <w:bCs/>
+                <w:sz w:val="18"/>
+                <w:szCs w:val="18"/>
+                <w:lang w:val="en-US"/>
+              </w:rPr>
+              <w:t>}}</w:t>
             </w:r>
           </w:p>
         </w:tc>
@@ -939,8 +959,18 @@
                 <w:sz w:val="18"/>
                 <w:szCs w:val="18"/>
               </w:rPr>
-              <w:t>{{InvolvedForces</w:t>
-            </w:r>
+              <w:t>{{</w:t>
+            </w:r>
+            <w:proofErr w:type="spellStart"/>
+            <w:r>
+              <w:rPr>
+                <w:bCs/>
+                <w:sz w:val="18"/>
+                <w:szCs w:val="18"/>
+              </w:rPr>
+              <w:t>InvolvedForces</w:t>
+            </w:r>
+            <w:proofErr w:type="spellEnd"/>
             <w:r>
               <w:rPr>
                 <w:bCs/>
@@ -979,8 +1009,18 @@
                 <w:sz w:val="18"/>
                 <w:szCs w:val="18"/>
               </w:rPr>
-              <w:t>{{TimeRank</w:t>
-            </w:r>
+              <w:t>{{</w:t>
+            </w:r>
+            <w:proofErr w:type="spellStart"/>
+            <w:r>
+              <w:rPr>
+                <w:bCs/>
+                <w:sz w:val="18"/>
+                <w:szCs w:val="18"/>
+              </w:rPr>
+              <w:t>TimeRank</w:t>
+            </w:r>
+            <w:proofErr w:type="spellEnd"/>
             <w:r>
               <w:rPr>
                 <w:bCs/>
@@ -1017,8 +1057,17 @@
                 <w:sz w:val="18"/>
                 <w:szCs w:val="18"/>
               </w:rPr>
-              <w:t>{{InvolvedForcesRank</w:t>
-            </w:r>
+              <w:t>{{</w:t>
+            </w:r>
+            <w:proofErr w:type="spellStart"/>
+            <w:r>
+              <w:rPr>
+                <w:sz w:val="18"/>
+                <w:szCs w:val="18"/>
+              </w:rPr>
+              <w:t>InvolvedForcesRank</w:t>
+            </w:r>
+            <w:proofErr w:type="spellEnd"/>
             <w:r>
               <w:rPr>
                 <w:sz w:val="18"/>
@@ -1062,15 +1111,7 @@
                 <w:sz w:val="18"/>
                 <w:szCs w:val="18"/>
               </w:rPr>
-              <w:t>{{TimeRank</w:t>
-            </w:r>
-            <w:r>
-              <w:rPr>
-                <w:bCs/>
-                <w:sz w:val="18"/>
-                <w:szCs w:val="18"/>
-              </w:rPr>
-              <w:t>1</w:t>
+              <w:t>{{TimeRank1</w:t>
             </w:r>
             <w:r>
               <w:rPr>
@@ -1109,8 +1150,17 @@
                 <w:sz w:val="18"/>
                 <w:szCs w:val="18"/>
               </w:rPr>
-              <w:t>{{InvolvedForcesRank</w:t>
-            </w:r>
+              <w:t>{{</w:t>
+            </w:r>
+            <w:proofErr w:type="spellStart"/>
+            <w:r>
+              <w:rPr>
+                <w:sz w:val="18"/>
+                <w:szCs w:val="18"/>
+              </w:rPr>
+              <w:t>InvolvedForcesRank</w:t>
+            </w:r>
+            <w:proofErr w:type="spellEnd"/>
             <w:r>
               <w:rPr>
                 <w:sz w:val="18"/>
@@ -1154,8 +1204,18 @@
                 <w:sz w:val="18"/>
                 <w:szCs w:val="18"/>
               </w:rPr>
-              <w:t>{{TimeRank</w:t>
-            </w:r>
+              <w:t>{{</w:t>
+            </w:r>
+            <w:proofErr w:type="spellStart"/>
+            <w:r>
+              <w:rPr>
+                <w:bCs/>
+                <w:sz w:val="18"/>
+                <w:szCs w:val="18"/>
+              </w:rPr>
+              <w:t>TimeRank</w:t>
+            </w:r>
+            <w:proofErr w:type="spellEnd"/>
             <w:r>
               <w:rPr>
                 <w:bCs/>
@@ -1192,8 +1252,17 @@
                 <w:sz w:val="18"/>
                 <w:szCs w:val="18"/>
               </w:rPr>
-              <w:t>{{InvolvedForcesRank</w:t>
-            </w:r>
+              <w:t>{{</w:t>
+            </w:r>
+            <w:proofErr w:type="spellStart"/>
+            <w:r>
+              <w:rPr>
+                <w:sz w:val="18"/>
+                <w:szCs w:val="18"/>
+              </w:rPr>
+              <w:t>InvolvedForcesRank</w:t>
+            </w:r>
+            <w:proofErr w:type="spellEnd"/>
             <w:r>
               <w:rPr>
                 <w:sz w:val="18"/>
@@ -1237,8 +1306,18 @@
                 <w:sz w:val="18"/>
                 <w:szCs w:val="18"/>
               </w:rPr>
-              <w:t>{{TimeRank</w:t>
-            </w:r>
+              <w:t>{{</w:t>
+            </w:r>
+            <w:proofErr w:type="spellStart"/>
+            <w:r>
+              <w:rPr>
+                <w:bCs/>
+                <w:sz w:val="18"/>
+                <w:szCs w:val="18"/>
+              </w:rPr>
+              <w:t>TimeRank</w:t>
+            </w:r>
+            <w:proofErr w:type="spellEnd"/>
             <w:r>
               <w:rPr>
                 <w:bCs/>
@@ -1275,8 +1354,17 @@
                 <w:sz w:val="18"/>
                 <w:szCs w:val="18"/>
               </w:rPr>
-              <w:t>{{InvolvedForcesRank</w:t>
-            </w:r>
+              <w:t>{{</w:t>
+            </w:r>
+            <w:proofErr w:type="spellStart"/>
+            <w:r>
+              <w:rPr>
+                <w:sz w:val="18"/>
+                <w:szCs w:val="18"/>
+              </w:rPr>
+              <w:t>InvolvedForcesRank</w:t>
+            </w:r>
+            <w:proofErr w:type="spellEnd"/>
             <w:r>
               <w:rPr>
                 <w:sz w:val="18"/>
@@ -1320,8 +1408,18 @@
                 <w:sz w:val="18"/>
                 <w:szCs w:val="18"/>
               </w:rPr>
-              <w:t>{{TimeRank</w:t>
-            </w:r>
+              <w:t>{{</w:t>
+            </w:r>
+            <w:proofErr w:type="spellStart"/>
+            <w:r>
+              <w:rPr>
+                <w:bCs/>
+                <w:sz w:val="18"/>
+                <w:szCs w:val="18"/>
+              </w:rPr>
+              <w:t>TimeRank</w:t>
+            </w:r>
+            <w:proofErr w:type="spellEnd"/>
             <w:r>
               <w:rPr>
                 <w:bCs/>
@@ -1390,8 +1488,18 @@
                 <w:sz w:val="18"/>
                 <w:szCs w:val="18"/>
               </w:rPr>
-              <w:t>{{TimeRank</w:t>
-            </w:r>
+              <w:t>{{</w:t>
+            </w:r>
+            <w:proofErr w:type="spellStart"/>
+            <w:r>
+              <w:rPr>
+                <w:bCs/>
+                <w:sz w:val="18"/>
+                <w:szCs w:val="18"/>
+              </w:rPr>
+              <w:t>TimeRank</w:t>
+            </w:r>
+            <w:proofErr w:type="spellEnd"/>
             <w:r>
               <w:rPr>
                 <w:bCs/>
@@ -1427,6 +1535,50 @@
                 <w:highlight w:val="yellow"/>
               </w:rPr>
             </w:pPr>
+            <w:r>
+              <w:rPr>
+                <w:rFonts w:ascii="Times New Roman" w:hAnsi="Times New Roman" w:cs="Times New Roman"/>
+                <w:sz w:val="18"/>
+                <w:szCs w:val="18"/>
+              </w:rPr>
+              <w:t>{{</w:t>
+            </w:r>
+            <w:proofErr w:type="spellStart"/>
+            <w:r>
+              <w:rPr>
+                <w:rFonts w:ascii="Times New Roman" w:hAnsi="Times New Roman" w:cs="Times New Roman"/>
+                <w:sz w:val="18"/>
+                <w:szCs w:val="18"/>
+              </w:rPr>
+              <w:t>InvolvedForce</w:t>
+            </w:r>
+            <w:r>
+              <w:rPr>
+                <w:rFonts w:ascii="Times New Roman" w:hAnsi="Times New Roman" w:cs="Times New Roman"/>
+                <w:sz w:val="18"/>
+                <w:szCs w:val="18"/>
+                <w:lang w:val="en-US"/>
+              </w:rPr>
+              <w:t>sRescue</w:t>
+            </w:r>
+            <w:proofErr w:type="spellEnd"/>
+            <w:r>
+              <w:rPr>
+                <w:rFonts w:ascii="Times New Roman" w:hAnsi="Times New Roman" w:cs="Times New Roman"/>
+                <w:sz w:val="18"/>
+                <w:szCs w:val="18"/>
+              </w:rPr>
+              <w:t>}</w:t>
+            </w:r>
+            <w:r>
+              <w:rPr>
+                <w:rFonts w:ascii="Times New Roman" w:hAnsi="Times New Roman" w:cs="Times New Roman"/>
+                <w:sz w:val="18"/>
+                <w:szCs w:val="18"/>
+                <w:lang w:val="en-US"/>
+              </w:rPr>
+              <w:t>}</w:t>
+            </w:r>
           </w:p>
         </w:tc>
         <w:tc>
@@ -1445,6 +1597,34 @@
                 <w:szCs w:val="18"/>
               </w:rPr>
             </w:pPr>
+            <w:r>
+              <w:rPr>
+                <w:rFonts w:ascii="Times New Roman" w:hAnsi="Times New Roman" w:cs="Times New Roman"/>
+                <w:bCs/>
+                <w:sz w:val="18"/>
+                <w:szCs w:val="18"/>
+              </w:rPr>
+              <w:t>{{Time</w:t>
+            </w:r>
+            <w:r>
+              <w:rPr>
+                <w:rFonts w:ascii="Times New Roman" w:hAnsi="Times New Roman" w:cs="Times New Roman"/>
+                <w:bCs/>
+                <w:sz w:val="18"/>
+                <w:szCs w:val="18"/>
+                <w:lang w:val="en-US"/>
+              </w:rPr>
+              <w:t>Rescue</w:t>
+            </w:r>
+            <w:r>
+              <w:rPr>
+                <w:rFonts w:ascii="Times New Roman" w:hAnsi="Times New Roman" w:cs="Times New Roman"/>
+                <w:bCs/>
+                <w:sz w:val="18"/>
+                <w:szCs w:val="18"/>
+              </w:rPr>
+              <w:t>}}</w:t>
+            </w:r>
           </w:p>
         </w:tc>
       </w:tr>
@@ -1654,8 +1834,38 @@
                 <w:rFonts w:ascii="Times New Roman" w:hAnsi="Times New Roman" w:cs="Times New Roman"/>
                 <w:b/>
                 <w:color w:val="000000"/>
-              </w:rPr>
-            </w:pPr>
+                <w:lang w:val="en-US"/>
+              </w:rPr>
+            </w:pPr>
+            <w:r>
+              <w:rPr>
+                <w:rFonts w:ascii="Times New Roman" w:hAnsi="Times New Roman" w:cs="Times New Roman"/>
+                <w:b/>
+                <w:color w:val="000000"/>
+                <w:lang w:val="en-US"/>
+              </w:rPr>
+              <w:t>{{</w:t>
+            </w:r>
+            <w:proofErr w:type="spellStart"/>
+            <w:r>
+              <w:rPr>
+                <w:rFonts w:ascii="Times New Roman" w:hAnsi="Times New Roman" w:cs="Times New Roman"/>
+                <w:b/>
+                <w:color w:val="000000"/>
+                <w:lang w:val="en-US"/>
+              </w:rPr>
+              <w:t>RescueTypes</w:t>
+            </w:r>
+            <w:proofErr w:type="spellEnd"/>
+            <w:r>
+              <w:rPr>
+                <w:rFonts w:ascii="Times New Roman" w:hAnsi="Times New Roman" w:cs="Times New Roman"/>
+                <w:b/>
+                <w:color w:val="000000"/>
+                <w:lang w:val="en-US"/>
+              </w:rPr>
+              <w:t>}}</w:t>
+            </w:r>
           </w:p>
         </w:tc>
       </w:tr>
@@ -1865,6 +2075,44 @@
                 <w:color w:val="000000"/>
               </w:rPr>
             </w:pPr>
+            <w:r>
+              <w:rPr>
+                <w:rFonts w:ascii="Times New Roman" w:hAnsi="Times New Roman" w:cs="Times New Roman"/>
+                <w:b/>
+                <w:color w:val="000000"/>
+                <w:lang w:val="en-US"/>
+              </w:rPr>
+              <w:t>{{</w:t>
+            </w:r>
+            <w:proofErr w:type="spellStart"/>
+            <w:r>
+              <w:rPr>
+                <w:rFonts w:ascii="Times New Roman" w:hAnsi="Times New Roman" w:cs="Times New Roman"/>
+                <w:b/>
+                <w:color w:val="000000"/>
+                <w:lang w:val="en-US"/>
+              </w:rPr>
+              <w:t>RescueT</w:t>
+            </w:r>
+            <w:r>
+              <w:rPr>
+                <w:rFonts w:ascii="Times New Roman" w:hAnsi="Times New Roman" w:cs="Times New Roman"/>
+                <w:b/>
+                <w:color w:val="000000"/>
+                <w:lang w:val="en-US"/>
+              </w:rPr>
+              <w:t>otal</w:t>
+            </w:r>
+            <w:proofErr w:type="spellEnd"/>
+            <w:r>
+              <w:rPr>
+                <w:rFonts w:ascii="Times New Roman" w:hAnsi="Times New Roman" w:cs="Times New Roman"/>
+                <w:b/>
+                <w:color w:val="000000"/>
+                <w:lang w:val="en-US"/>
+              </w:rPr>
+              <w:t>}}</w:t>
+            </w:r>
           </w:p>
         </w:tc>
       </w:tr>
@@ -2518,6 +2766,7 @@
   <w:style w:type="character" w:default="1" w:styleId="a0">
     <w:name w:val="Default Paragraph Font"/>
     <w:uiPriority w:val="1"/>
+    <w:semiHidden/>
     <w:unhideWhenUsed/>
   </w:style>
   <w:style w:type="table" w:default="1" w:styleId="a1">

</xml_diff>